<commit_message>
WF-25: form now leads, reply is the fallback
Both branches invited a reply twice and offered the form only for large files,
while WF-26 triggers on Form Submitted. The path presented as easiest was the
one that fired nothing: no tag, no queue, no notification, no thank-you, no
gift card. A customer following the instructions exactly, hitting reply with a
video, disappeared from the system, which from their side is indistinguishable
from being ignored after they made a video because you asked.

Form now leads for both formats. Reply stays available, because telling people
not to reply costs testimonials, and 'I will pick it up myself' sets the
expectation that it is the personal route rather than the instant one.

Consent still lives on the form only, so a reply-path testimonial still needs
checking against what the person actually agreed to before publishing.

Cross-reference in WF-26 updated to match.

Co-Authored-By: Claude Opus 5 <noreply@anthropic.com>
</commit_message>
<xml_diff>
--- a/campaigns/WF-25-testimonial-request.docx
+++ b/campaigns/WF-25-testimonial-request.docx
@@ -324,19 +324,19 @@
         <w:rPr>
           <w:rStyle w:val="VerbatimChar"/>
         </w:rPr>
-        <w:t xml:space="preserve">To send a video, reply with it or drop it here if it is large: Upload Here</w:t>
-      </w:r>
-      <w:r>
-        <w:br/>
-      </w:r>
-      <w:r>
-        <w:br/>
-      </w:r>
-      <w:r>
-        <w:rPr>
-          <w:rStyle w:val="VerbatimChar"/>
-        </w:rPr>
-        <w:t xml:space="preserve">To send a written note, just hit reply. Whatever is easiest.</w:t>
+        <w:t xml:space="preserve">Easiest way to send either one is here: Upload Here. Video or typed note, both go to the same place.</w:t>
+      </w:r>
+      <w:r>
+        <w:br/>
+      </w:r>
+      <w:r>
+        <w:br/>
+      </w:r>
+      <w:r>
+        <w:rPr>
+          <w:rStyle w:val="VerbatimChar"/>
+        </w:rPr>
+        <w:t xml:space="preserve">If you would rather just hit reply, that works too and I will pick it up myself.</w:t>
       </w:r>
       <w:r>
         <w:br/>
@@ -433,13 +433,13 @@
           <w:b/>
           <w:bCs/>
         </w:rPr>
-        <w:t xml:space="preserve">CORRECTED Aug 3, twice.</w:t>
-      </w:r>
-      <w:r>
-        <w:t xml:space="preserve"> </w:t>
-      </w:r>
-      <w:r>
-        <w:t xml:space="preserve">Full product name on first reference, and bullets changed from</w:t>
+        <w:t xml:space="preserve">CORRECTED Aug 3, three times.</w:t>
+      </w:r>
+      <w:r>
+        <w:t xml:space="preserve"> </w:t>
+      </w:r>
+      <w:r>
+        <w:t xml:space="preserve">Full product name on first reference, bullets changed from</w:t>
       </w:r>
       <w:r>
         <w:t xml:space="preserve"> </w:t>
@@ -454,7 +454,7 @@
         <w:t xml:space="preserve"> </w:t>
       </w:r>
       <w:r>
-        <w:t xml:space="preserve">to hyphens.</w:t>
+        <w:t xml:space="preserve">to hyphens, and the send options reordered so the form leads. See the change log.</w:t>
       </w:r>
     </w:p>
     <w:p>
@@ -614,19 +614,19 @@
         <w:rPr>
           <w:rStyle w:val="VerbatimChar"/>
         </w:rPr>
-        <w:t xml:space="preserve">To send a video, reply with it attached, or drop it here if it is large: Upload Video Here</w:t>
-      </w:r>
-      <w:r>
-        <w:br/>
-      </w:r>
-      <w:r>
-        <w:br/>
-      </w:r>
-      <w:r>
-        <w:rPr>
-          <w:rStyle w:val="VerbatimChar"/>
-        </w:rPr>
-        <w:t xml:space="preserve">To send a written note, just hit reply. Whatever is easiest for you.</w:t>
+        <w:t xml:space="preserve">Easiest way to send either one is here: Upload Video Here. Video or a typed note, both go to the same place.</w:t>
+      </w:r>
+      <w:r>
+        <w:br/>
+      </w:r>
+      <w:r>
+        <w:br/>
+      </w:r>
+      <w:r>
+        <w:rPr>
+          <w:rStyle w:val="VerbatimChar"/>
+        </w:rPr>
+        <w:t xml:space="preserve">If you would rather just hit reply, that works too and I will pick it up myself.</w:t>
       </w:r>
       <w:r>
         <w:br/>
@@ -723,13 +723,13 @@
           <w:b/>
           <w:bCs/>
         </w:rPr>
-        <w:t xml:space="preserve">CORRECTED Aug 3, twice.</w:t>
-      </w:r>
-      <w:r>
-        <w:t xml:space="preserve"> </w:t>
-      </w:r>
-      <w:r>
-        <w:t xml:space="preserve">Same two changes as the facility branch.</w:t>
+        <w:t xml:space="preserve">CORRECTED Aug 3, three times.</w:t>
+      </w:r>
+      <w:r>
+        <w:t xml:space="preserve"> </w:t>
+      </w:r>
+      <w:r>
+        <w:t xml:space="preserve">Same three changes as the facility branch.</w:t>
       </w:r>
     </w:p>
     <w:p>
@@ -921,7 +921,7 @@
     </w:p>
     <w:bookmarkEnd w:id="12"/>
     <w:bookmarkEnd w:id="13"/>
-    <w:bookmarkStart w:id="15" w:name="change-log-2026-08-03"/>
+    <w:bookmarkStart w:id="16" w:name="change-log-2026-08-03"/>
     <w:p>
       <w:pPr>
         <w:pStyle w:val="Heading1"/>
@@ -941,7 +941,8 @@
           <w:insideV w:val="single" w:sz="6" w:space="0" w:color="AAAAAA"/>
         </w:tblBorders>
         <w:tblStyle w:val="Table"/>
-        <w:tblW w:type="auto" w:w="0"/>
+        <w:tblW w:type="pct" w:w="5000"/>
+        <w:tblLayout w:type="fixed"/>
         <w:tblLook w:firstRow="1" w:lastRow="0" w:firstColumn="0" w:lastColumn="0" w:noHBand="0" w:noVBand="0" w:val="0020"/>
       </w:tblPr>
       <w:tblGrid>
@@ -1072,13 +1073,219 @@
           </w:p>
         </w:tc>
       </w:tr>
+      <w:tr>
+        <w:tc>
+          <w:tcPr/>
+          <w:p>
+            <w:pPr>
+              <w:pStyle w:val="Compact"/>
+            </w:pPr>
+            <w:r>
+              <w:t xml:space="preserve">3</w:t>
+            </w:r>
+          </w:p>
+        </w:tc>
+        <w:tc>
+          <w:tcPr/>
+          <w:p>
+            <w:pPr>
+              <w:pStyle w:val="Compact"/>
+            </w:pPr>
+            <w:r>
+              <w:t xml:space="preserve">Both</w:t>
+            </w:r>
+          </w:p>
+        </w:tc>
+        <w:tc>
+          <w:tcPr/>
+          <w:p>
+            <w:pPr>
+              <w:pStyle w:val="Compact"/>
+            </w:pPr>
+            <w:r>
+              <w:t xml:space="preserve">Send options reordered so the form leads and reply is the fallback</w:t>
+            </w:r>
+          </w:p>
+        </w:tc>
+      </w:tr>
     </w:tbl>
-    <w:bookmarkStart w:id="14" w:name="on-the-product-name-for-the-record"/>
+    <w:bookmarkStart w:id="14" w:name="X80f87b9c7e23e2213777d936d3ab5536a473ca3"/>
     <w:p>
       <w:pPr>
         <w:pStyle w:val="Heading2"/>
       </w:pPr>
       <w:r>
+        <w:t xml:space="preserve">Why the send options were reordered, which is the change that matters</w:t>
+      </w:r>
+    </w:p>
+    <w:p>
+      <w:pPr>
+        <w:pStyle w:val="FirstParagraph"/>
+      </w:pPr>
+      <w:r>
+        <w:t xml:space="preserve">Both branches originally invited a reply twice and offered the form only for large files:</w:t>
+      </w:r>
+    </w:p>
+    <w:p>
+      <w:pPr>
+        <w:pStyle w:val="BlockText"/>
+      </w:pPr>
+      <w:r>
+        <w:t xml:space="preserve">To send a video,</w:t>
+      </w:r>
+      <w:r>
+        <w:t xml:space="preserve"> </w:t>
+      </w:r>
+      <w:r>
+        <w:rPr>
+          <w:b/>
+          <w:bCs/>
+        </w:rPr>
+        <w:t xml:space="preserve">reply with it</w:t>
+      </w:r>
+      <w:r>
+        <w:t xml:space="preserve"> </w:t>
+      </w:r>
+      <w:r>
+        <w:t xml:space="preserve">or drop it here if it is large: Upload Here</w:t>
+      </w:r>
+    </w:p>
+    <w:p>
+      <w:pPr>
+        <w:pStyle w:val="BlockText"/>
+      </w:pPr>
+      <w:r>
+        <w:t xml:space="preserve">To send a written note,</w:t>
+      </w:r>
+      <w:r>
+        <w:t xml:space="preserve"> </w:t>
+      </w:r>
+      <w:r>
+        <w:rPr>
+          <w:b/>
+          <w:bCs/>
+        </w:rPr>
+        <w:t xml:space="preserve">just hit reply</w:t>
+      </w:r>
+      <w:r>
+        <w:t xml:space="preserve">.</w:t>
+      </w:r>
+    </w:p>
+    <w:p>
+      <w:pPr>
+        <w:pStyle w:val="FirstParagraph"/>
+      </w:pPr>
+      <w:r>
+        <w:rPr>
+          <w:b/>
+          <w:bCs/>
+        </w:rPr>
+        <w:t xml:space="preserve">WF-26 triggers on Form Submitted.</w:t>
+      </w:r>
+      <w:r>
+        <w:t xml:space="preserve"> </w:t>
+      </w:r>
+      <w:r>
+        <w:t xml:space="preserve">So the path being presented as easiest was the one that fires nothing: no</w:t>
+      </w:r>
+      <w:r>
+        <w:t xml:space="preserve"> </w:t>
+      </w:r>
+      <w:r>
+        <w:rPr>
+          <w:rStyle w:val="VerbatimChar"/>
+        </w:rPr>
+        <w:t xml:space="preserve">testimonial_submitted</w:t>
+      </w:r>
+      <w:r>
+        <w:t xml:space="preserve">, no</w:t>
+      </w:r>
+      <w:r>
+        <w:t xml:space="preserve"> </w:t>
+      </w:r>
+      <w:r>
+        <w:rPr>
+          <w:rStyle w:val="VerbatimChar"/>
+        </w:rPr>
+        <w:t xml:space="preserve">gift_card_pending</w:t>
+      </w:r>
+      <w:r>
+        <w:t xml:space="preserve">, no internal notification, no thank-you, no gift card.</w:t>
+      </w:r>
+    </w:p>
+    <w:p>
+      <w:pPr>
+        <w:pStyle w:val="BodyText"/>
+      </w:pPr>
+      <w:r>
+        <w:t xml:space="preserve">A customer following the instructions exactly, hitting reply with a video, disappeared from the system. From their side, having made a video because you asked, it is indistinguishable from being ignored.</w:t>
+      </w:r>
+    </w:p>
+    <w:p>
+      <w:pPr>
+        <w:pStyle w:val="BodyText"/>
+      </w:pPr>
+      <w:r>
+        <w:t xml:space="preserve">The form now leads for both formats, so most people take the tracked path automatically. Reply stays available, because telling people not to reply costs testimonials.</w:t>
+      </w:r>
+    </w:p>
+    <w:p>
+      <w:pPr>
+        <w:pStyle w:val="BodyText"/>
+      </w:pPr>
+      <w:r>
+        <w:rPr>
+          <w:b/>
+          <w:bCs/>
+        </w:rPr>
+        <w:t xml:space="preserve">“I will pick it up myself”</w:t>
+      </w:r>
+      <w:r>
+        <w:rPr>
+          <w:b/>
+          <w:bCs/>
+        </w:rPr>
+        <w:t xml:space="preserve"> </w:t>
+      </w:r>
+      <w:r>
+        <w:rPr>
+          <w:b/>
+          <w:bCs/>
+        </w:rPr>
+        <w:t xml:space="preserve">is deliberate.</w:t>
+      </w:r>
+      <w:r>
+        <w:t xml:space="preserve"> </w:t>
+      </w:r>
+      <w:r>
+        <w:t xml:space="preserve">It is true, a reply genuinely needs a human, and it sets the expectation that the reply route is the personal one rather than the instant one. That covers the gap if a reply-path thank-you arrives a day later than a form-path one.</w:t>
+      </w:r>
+    </w:p>
+    <w:p>
+      <w:pPr>
+        <w:pStyle w:val="BodyText"/>
+      </w:pPr>
+      <w:r>
+        <w:rPr>
+          <w:b/>
+          <w:bCs/>
+        </w:rPr>
+        <w:t xml:space="preserve">Still unfixed by this change:</w:t>
+      </w:r>
+      <w:r>
+        <w:t xml:space="preserve"> </w:t>
+      </w:r>
+      <w:r>
+        <w:t xml:space="preserve">a reply records no consent, since consent lives on the form. Publishing a reply-path testimonial still means going back to the message to check what was agreed.</w:t>
+      </w:r>
+    </w:p>
+    <w:bookmarkEnd w:id="14"/>
+    <w:bookmarkStart w:id="15" w:name="on-the-product-name-for-the-record"/>
+    <w:p>
+      <w:pPr>
+        <w:pStyle w:val="Heading2"/>
+      </w:pPr>
+      <w:r>
         <w:t xml:space="preserve">On the product name, for the record</w:t>
       </w:r>
     </w:p>
@@ -1118,8 +1325,8 @@
         <w:t xml:space="preserve">Worth knowing the tension exists, because it recurs in WF-26 and WF-08, which also address people who already own the device.</w:t>
       </w:r>
     </w:p>
-    <w:bookmarkEnd w:id="14"/>
     <w:bookmarkEnd w:id="15"/>
+    <w:bookmarkEnd w:id="16"/>
     <w:sectPr>
       <w:footnotePr>
         <w:numRestart w:val="eachSect"/>

</xml_diff>